<commit_message>
carry D1 on host B across 105 runs, not one memory sweep
Table 3 varies the resource on host A and finds the reported hit rate unmoved.
That leaves open whether a full reading is a property of one sweep, so the same
observation is now checked against every run the host-B engine recorded. All 105
runs report at or near saturation while every one of them costs between 25.83 and
280.65 GB, and the two runs below saturation still cost 181.19 and 280.65 GB --
a hit costs bytes at any rate, not only at 100%.

The two tables come from different machines, different session shapes and
different dates, so neither depends on the other.

Table numbering shifts by one from the old Table 4 on; captions and in-text
references were moved together by matching only the forms a reference can take
(caption with an ideographic space, or a mention closed by punctuation).
</commit_message>
<xml_diff>
--- a/papers/提交稿-命中率通胀三平面分离.docx
+++ b/papers/提交稿-命中率通胀三平面分离.docx
@@ -398,7 +398,7 @@
           <w:b w:val="0"/>
           <w:sz w:val="18"/>
         </w:rPr>
-        <w:t>。以功效分析给出三个平面各自的最小可检测效应（MDE），并用一组真实的策略对照量化"用错平面的代价"：字节平面 3 次运行确证 1.278% 的效应，时间平面需约 13 300 次运行（约 1 000 机时），样本量比约 4 400 倍（表 6）。</w:t>
+        <w:t>。以功效分析给出三个平面各自的最小可检测效应（MDE），并用一组真实的策略对照量化"用错平面的代价"：字节平面 3 次运行确证 1.278% 的效应，时间平面需约 13 300 次运行（约 1 000 机时），样本量比约 4 400 倍（表 7）。</w:t>
       </w:r>
     </w:p>
     <w:p>
@@ -2587,7 +2587,7 @@
           <w:b w:val="0"/>
           <w:sz w:val="18"/>
         </w:rPr>
-        <w:t xml:space="preserve"> 选择 MoE 因其权重流在带宽受限主机上占端到端的主导份额（本案专家流占 79.6%，表 8），是度量分离最容易显形的负载，不代表框架仅适用于 MoE。每词元专家理论全量载入 B_full(1) = 92 层 × 16 专家 × 17.55 MB = 25.83 GB。</w:t>
+        <w:t xml:space="preserve"> 选择 MoE 因其权重流在带宽受限主机上占端到端的主导份额（本案专家流占 79.6%，表 9），是度量分离最容易显形的负载，不代表框架仅适用于 MoE。每词元专家理论全量载入 B_full(1) = 92 层 × 16 专家 × 17.55 MB = 25.83 GB。</w:t>
       </w:r>
     </w:p>
     <w:p>
@@ -4182,6 +4182,897 @@
     </w:p>
     <w:p>
       <w:pPr>
+        <w:spacing w:after="40" w:line="276" w:lineRule="auto"/>
+        <w:ind w:firstLine="360"/>
+      </w:pPr>
+      <w:r>
+        <w:rPr>
+          <w:rFonts w:ascii="Times New Roman" w:hAnsi="Times New Roman" w:eastAsia="宋体"/>
+          <w:b/>
+          <w:sz w:val="18"/>
+        </w:rPr>
+        <w:t>同一现象在主机 B 上的跨版本证据。</w:t>
+      </w:r>
+      <w:r>
+        <w:rPr>
+          <w:rFonts w:ascii="Times New Roman" w:hAnsi="Times New Roman" w:eastAsia="宋体"/>
+          <w:b w:val="0"/>
+          <w:sz w:val="18"/>
+        </w:rPr>
+        <w:t xml:space="preserve"> 表 3 改变的是资源，观察到的是命中率随资源"不变"；若换一批形态与时间都不同的实验仍见满格，则说明满格与资源无关。主机 B 的引擎在每次运行结束时都打印三个量：自报命中率、这些命中实际付出的 I/O 字节（</w:t>
+      </w:r>
+      <w:r>
+        <w:rPr>
+          <w:rFonts w:ascii="Consolas" w:hAnsi="Consolas"/>
+          <w:color w:val="000080"/>
+          <w:sz w:val="18"/>
+        </w:rPr>
+        <w:t>hit I/O</w:t>
+      </w:r>
+      <w:r>
+        <w:rPr>
+          <w:rFonts w:ascii="Times New Roman" w:hAnsi="Times New Roman" w:eastAsia="宋体"/>
+          <w:b w:val="0"/>
+          <w:sz w:val="18"/>
+        </w:rPr>
+        <w:t>）、以及引擎自陈的真实常驻命中率（</w:t>
+      </w:r>
+      <w:r>
+        <w:rPr>
+          <w:rFonts w:ascii="Consolas" w:hAnsi="Consolas"/>
+          <w:color w:val="000080"/>
+          <w:sz w:val="18"/>
+        </w:rPr>
+        <w:t>TRUE resident hit rate</w:t>
+      </w:r>
+      <w:r>
+        <w:rPr>
+          <w:rFonts w:ascii="Times New Roman" w:hAnsi="Times New Roman" w:eastAsia="宋体"/>
+          <w:b w:val="0"/>
+          <w:sz w:val="18"/>
+        </w:rPr>
+        <w:t xml:space="preserve">）。将 v0—v66 全部 105 轮汇总（表 4）：103 轮自报命中率恰为 100.00%；全部 105 轮的 </w:t>
+      </w:r>
+      <w:r>
+        <w:rPr>
+          <w:rFonts w:ascii="Consolas" w:hAnsi="Consolas"/>
+          <w:color w:val="000080"/>
+          <w:sz w:val="18"/>
+        </w:rPr>
+        <w:t>hit I/O</w:t>
+      </w:r>
+      <w:r>
+        <w:rPr>
+          <w:rFonts w:ascii="Times New Roman" w:hAnsi="Times New Roman" w:eastAsia="宋体"/>
+          <w:b w:val="0"/>
+          <w:sz w:val="18"/>
+        </w:rPr>
+        <w:t xml:space="preserve"> 为 25.83—280.65 GB，中位数 115.29 GB；自报命中率与 </w:t>
+      </w:r>
+      <w:r>
+        <w:rPr>
+          <w:rFonts w:ascii="Consolas" w:hAnsi="Consolas"/>
+          <w:color w:val="000080"/>
+          <w:sz w:val="18"/>
+        </w:rPr>
+        <w:t>TRUE resident</w:t>
+      </w:r>
+      <w:r>
+        <w:rPr>
+          <w:rFonts w:ascii="Times New Roman" w:hAnsi="Times New Roman" w:eastAsia="宋体"/>
+          <w:b w:val="0"/>
+          <w:sz w:val="18"/>
+        </w:rPr>
+        <w:t xml:space="preserve"> 之差为 57.00—100.00 个百分点，中位数 96.20。</w:t>
+      </w:r>
+    </w:p>
+    <w:p>
+      <w:pPr>
+        <w:spacing w:before="80" w:after="20"/>
+        <w:jc w:val="center"/>
+      </w:pPr>
+      <w:r>
+        <w:rPr>
+          <w:rFonts w:ascii="Times New Roman" w:hAnsi="Times New Roman" w:eastAsia="宋体"/>
+          <w:b w:val="0"/>
+          <w:sz w:val="15"/>
+        </w:rPr>
+        <w:t>表 4　主机 B 跨版本的自报命中率与命中实际 I/O（105 轮，节选 6 轮）</w:t>
+      </w:r>
+    </w:p>
+    <w:p>
+      <w:pPr>
+        <w:spacing w:before="80" w:after="20"/>
+        <w:jc w:val="center"/>
+      </w:pPr>
+      <w:r>
+        <w:rPr>
+          <w:rFonts w:ascii="Times New Roman" w:hAnsi="Times New Roman" w:eastAsia="Times New Roman"/>
+          <w:b w:val="0"/>
+          <w:sz w:val="15"/>
+        </w:rPr>
+        <w:t>Table 4</w:t>
+        <w:tab/>
+        <w:t>Self-reported hit rate and the I/O those hits cost, across versions on host B (105 runs, 6 shown)</w:t>
+      </w:r>
+    </w:p>
+    <w:tbl>
+      <w:tblPr>
+        <w:tblStyle w:val="TableGrid"/>
+        <w:tblW w:type="auto" w:w="0"/>
+        <w:tblLook w:firstColumn="1" w:firstRow="1" w:lastColumn="0" w:lastRow="0" w:noHBand="0" w:noVBand="1" w:val="04A0"/>
+        <w:tblBorders>
+          <w:top w:val="single" w:sz="12" w:space="0" w:color="000000"/>
+          <w:bottom w:val="single" w:sz="12" w:space="0" w:color="000000"/>
+          <w:left w:val="none" w:sz="0" w:color="auto"/>
+          <w:right w:val="none" w:sz="0" w:color="auto"/>
+          <w:insideH w:val="none" w:sz="0" w:color="auto"/>
+          <w:insideV w:val="none" w:sz="0" w:color="auto"/>
+        </w:tblBorders>
+        <w:tblCellMar>
+          <w:left w:w="40" w:type="dxa"/>
+          <w:right w:w="40" w:type="dxa"/>
+        </w:tblCellMar>
+        <w:tblLayout w:type="fixed"/>
+      </w:tblPr>
+      <w:tblGrid>
+        <w:gridCol w:w="1371"/>
+        <w:gridCol w:w="831"/>
+        <w:gridCol w:w="1061"/>
+        <w:gridCol w:w="831"/>
+        <w:gridCol w:w="781"/>
+      </w:tblGrid>
+      <w:tr>
+        <w:tc>
+          <w:tcPr>
+            <w:tcW w:type="dxa" w:w="1371"/>
+            <w:tcBorders>
+              <w:bottom w:val="single" w:sz="6" w:space="0" w:color="000000"/>
+            </w:tcBorders>
+          </w:tcPr>
+          <w:p>
+            <w:pPr>
+              <w:spacing w:after="0" w:before="0" w:line="240" w:lineRule="auto"/>
+            </w:pPr>
+            <w:r/>
+            <w:r>
+              <w:rPr>
+                <w:rFonts w:ascii="Times New Roman" w:hAnsi="Times New Roman" w:eastAsia="黑体"/>
+                <w:b/>
+                <w:sz w:val="18"/>
+              </w:rPr>
+              <w:t>版本</w:t>
+            </w:r>
+          </w:p>
+        </w:tc>
+        <w:tc>
+          <w:tcPr>
+            <w:tcW w:type="dxa" w:w="831"/>
+            <w:tcBorders>
+              <w:bottom w:val="single" w:sz="6" w:space="0" w:color="000000"/>
+            </w:tcBorders>
+          </w:tcPr>
+          <w:p>
+            <w:pPr>
+              <w:spacing w:after="0" w:before="0" w:line="240" w:lineRule="auto"/>
+            </w:pPr>
+            <w:r/>
+            <w:r>
+              <w:rPr>
+                <w:rFonts w:ascii="Times New Roman" w:hAnsi="Times New Roman" w:eastAsia="黑体"/>
+                <w:b/>
+                <w:sz w:val="18"/>
+              </w:rPr>
+              <w:t>自报命中率/%</w:t>
+            </w:r>
+          </w:p>
+        </w:tc>
+        <w:tc>
+          <w:tcPr>
+            <w:tcW w:type="dxa" w:w="1061"/>
+            <w:tcBorders>
+              <w:bottom w:val="single" w:sz="6" w:space="0" w:color="000000"/>
+            </w:tcBorders>
+          </w:tcPr>
+          <w:p>
+            <w:pPr>
+              <w:spacing w:after="0" w:before="0" w:line="240" w:lineRule="auto"/>
+            </w:pPr>
+            <w:r/>
+            <w:r>
+              <w:rPr>
+                <w:rFonts w:ascii="Times New Roman" w:hAnsi="Times New Roman" w:eastAsia="黑体"/>
+                <w:b/>
+                <w:sz w:val="18"/>
+              </w:rPr>
+              <w:t>TRUE resident/%</w:t>
+            </w:r>
+          </w:p>
+        </w:tc>
+        <w:tc>
+          <w:tcPr>
+            <w:tcW w:type="dxa" w:w="831"/>
+            <w:tcBorders>
+              <w:bottom w:val="single" w:sz="6" w:space="0" w:color="000000"/>
+            </w:tcBorders>
+          </w:tcPr>
+          <w:p>
+            <w:pPr>
+              <w:spacing w:after="0" w:before="0" w:line="240" w:lineRule="auto"/>
+            </w:pPr>
+            <w:r/>
+            <w:r>
+              <w:rPr>
+                <w:rFonts w:ascii="Times New Roman" w:hAnsi="Times New Roman" w:eastAsia="黑体"/>
+                <w:b/>
+                <w:sz w:val="18"/>
+              </w:rPr>
+              <w:t>`hit I/O`/GB</w:t>
+            </w:r>
+          </w:p>
+        </w:tc>
+        <w:tc>
+          <w:tcPr>
+            <w:tcW w:type="dxa" w:w="781"/>
+            <w:tcBorders>
+              <w:bottom w:val="single" w:sz="6" w:space="0" w:color="000000"/>
+            </w:tcBorders>
+          </w:tcPr>
+          <w:p>
+            <w:pPr>
+              <w:spacing w:after="0" w:before="0" w:line="240" w:lineRule="auto"/>
+            </w:pPr>
+            <w:r/>
+            <w:r>
+              <w:rPr>
+                <w:rFonts w:ascii="Times New Roman" w:hAnsi="Times New Roman" w:eastAsia="黑体"/>
+                <w:b/>
+                <w:sz w:val="18"/>
+              </w:rPr>
+              <w:t>差/百分点</w:t>
+            </w:r>
+          </w:p>
+        </w:tc>
+      </w:tr>
+      <w:tr>
+        <w:tc>
+          <w:tcPr>
+            <w:tcW w:type="dxa" w:w="1371"/>
+          </w:tcPr>
+          <w:p>
+            <w:pPr>
+              <w:spacing w:after="0" w:before="0" w:line="240" w:lineRule="auto"/>
+            </w:pPr>
+            <w:r/>
+            <w:r>
+              <w:rPr>
+                <w:rFonts w:ascii="Times New Roman" w:hAnsi="Times New Roman" w:eastAsia="宋体"/>
+                <w:b w:val="0"/>
+                <w:sz w:val="18"/>
+              </w:rPr>
+              <w:t>v4</w:t>
+            </w:r>
+          </w:p>
+        </w:tc>
+        <w:tc>
+          <w:tcPr>
+            <w:tcW w:type="dxa" w:w="831"/>
+          </w:tcPr>
+          <w:p>
+            <w:pPr>
+              <w:spacing w:after="0" w:before="0" w:line="240" w:lineRule="auto"/>
+            </w:pPr>
+            <w:r/>
+            <w:r>
+              <w:rPr>
+                <w:rFonts w:ascii="Times New Roman" w:hAnsi="Times New Roman" w:eastAsia="宋体"/>
+                <w:b w:val="0"/>
+                <w:sz w:val="18"/>
+              </w:rPr>
+              <w:t>99.05</w:t>
+            </w:r>
+          </w:p>
+        </w:tc>
+        <w:tc>
+          <w:tcPr>
+            <w:tcW w:type="dxa" w:w="1061"/>
+          </w:tcPr>
+          <w:p>
+            <w:pPr>
+              <w:spacing w:after="0" w:before="0" w:line="240" w:lineRule="auto"/>
+            </w:pPr>
+            <w:r/>
+            <w:r>
+              <w:rPr>
+                <w:rFonts w:ascii="Times New Roman" w:hAnsi="Times New Roman" w:eastAsia="宋体"/>
+                <w:b w:val="0"/>
+                <w:sz w:val="18"/>
+              </w:rPr>
+              <w:t>0.00</w:t>
+            </w:r>
+          </w:p>
+        </w:tc>
+        <w:tc>
+          <w:tcPr>
+            <w:tcW w:type="dxa" w:w="831"/>
+          </w:tcPr>
+          <w:p>
+            <w:pPr>
+              <w:spacing w:after="0" w:before="0" w:line="240" w:lineRule="auto"/>
+            </w:pPr>
+            <w:r/>
+            <w:r>
+              <w:rPr>
+                <w:rFonts w:ascii="Times New Roman" w:hAnsi="Times New Roman" w:eastAsia="宋体"/>
+                <w:b w:val="0"/>
+                <w:sz w:val="18"/>
+              </w:rPr>
+              <w:t>280.65</w:t>
+            </w:r>
+          </w:p>
+        </w:tc>
+        <w:tc>
+          <w:tcPr>
+            <w:tcW w:type="dxa" w:w="781"/>
+          </w:tcPr>
+          <w:p>
+            <w:pPr>
+              <w:spacing w:after="0" w:before="0" w:line="240" w:lineRule="auto"/>
+            </w:pPr>
+            <w:r/>
+            <w:r>
+              <w:rPr>
+                <w:rFonts w:ascii="Times New Roman" w:hAnsi="Times New Roman" w:eastAsia="宋体"/>
+                <w:b w:val="0"/>
+                <w:sz w:val="18"/>
+              </w:rPr>
+              <w:t>99.05</w:t>
+            </w:r>
+          </w:p>
+        </w:tc>
+      </w:tr>
+      <w:tr>
+        <w:tc>
+          <w:tcPr>
+            <w:tcW w:type="dxa" w:w="1371"/>
+          </w:tcPr>
+          <w:p>
+            <w:pPr>
+              <w:spacing w:after="0" w:before="0" w:line="240" w:lineRule="auto"/>
+            </w:pPr>
+            <w:r/>
+            <w:r>
+              <w:rPr>
+                <w:rFonts w:ascii="Times New Roman" w:hAnsi="Times New Roman" w:eastAsia="宋体"/>
+                <w:b w:val="0"/>
+                <w:sz w:val="18"/>
+              </w:rPr>
+              <w:t>v24</w:t>
+            </w:r>
+          </w:p>
+        </w:tc>
+        <w:tc>
+          <w:tcPr>
+            <w:tcW w:type="dxa" w:w="831"/>
+          </w:tcPr>
+          <w:p>
+            <w:pPr>
+              <w:spacing w:after="0" w:before="0" w:line="240" w:lineRule="auto"/>
+            </w:pPr>
+            <w:r/>
+            <w:r>
+              <w:rPr>
+                <w:rFonts w:ascii="Times New Roman" w:hAnsi="Times New Roman" w:eastAsia="宋体"/>
+                <w:b w:val="0"/>
+                <w:sz w:val="18"/>
+              </w:rPr>
+              <w:t>100.00</w:t>
+            </w:r>
+          </w:p>
+        </w:tc>
+        <w:tc>
+          <w:tcPr>
+            <w:tcW w:type="dxa" w:w="1061"/>
+          </w:tcPr>
+          <w:p>
+            <w:pPr>
+              <w:spacing w:after="0" w:before="0" w:line="240" w:lineRule="auto"/>
+            </w:pPr>
+            <w:r/>
+            <w:r>
+              <w:rPr>
+                <w:rFonts w:ascii="Times New Roman" w:hAnsi="Times New Roman" w:eastAsia="宋体"/>
+                <w:b w:val="0"/>
+                <w:sz w:val="18"/>
+              </w:rPr>
+              <w:t>12.23</w:t>
+            </w:r>
+          </w:p>
+        </w:tc>
+        <w:tc>
+          <w:tcPr>
+            <w:tcW w:type="dxa" w:w="831"/>
+          </w:tcPr>
+          <w:p>
+            <w:pPr>
+              <w:spacing w:after="0" w:before="0" w:line="240" w:lineRule="auto"/>
+            </w:pPr>
+            <w:r/>
+            <w:r>
+              <w:rPr>
+                <w:rFonts w:ascii="Times New Roman" w:hAnsi="Times New Roman" w:eastAsia="宋体"/>
+                <w:b w:val="0"/>
+                <w:sz w:val="18"/>
+              </w:rPr>
+              <w:t>195.07</w:t>
+            </w:r>
+          </w:p>
+        </w:tc>
+        <w:tc>
+          <w:tcPr>
+            <w:tcW w:type="dxa" w:w="781"/>
+          </w:tcPr>
+          <w:p>
+            <w:pPr>
+              <w:spacing w:after="0" w:before="0" w:line="240" w:lineRule="auto"/>
+            </w:pPr>
+            <w:r/>
+            <w:r>
+              <w:rPr>
+                <w:rFonts w:ascii="Times New Roman" w:hAnsi="Times New Roman" w:eastAsia="宋体"/>
+                <w:b w:val="0"/>
+                <w:sz w:val="18"/>
+              </w:rPr>
+              <w:t>87.77</w:t>
+            </w:r>
+          </w:p>
+        </w:tc>
+      </w:tr>
+      <w:tr>
+        <w:tc>
+          <w:tcPr>
+            <w:tcW w:type="dxa" w:w="1371"/>
+          </w:tcPr>
+          <w:p>
+            <w:pPr>
+              <w:spacing w:after="0" w:before="0" w:line="240" w:lineRule="auto"/>
+            </w:pPr>
+            <w:r/>
+            <w:r>
+              <w:rPr>
+                <w:rFonts w:ascii="Times New Roman" w:hAnsi="Times New Roman" w:eastAsia="宋体"/>
+                <w:b w:val="0"/>
+                <w:sz w:val="18"/>
+              </w:rPr>
+              <w:t>v16</w:t>
+            </w:r>
+          </w:p>
+        </w:tc>
+        <w:tc>
+          <w:tcPr>
+            <w:tcW w:type="dxa" w:w="831"/>
+          </w:tcPr>
+          <w:p>
+            <w:pPr>
+              <w:spacing w:after="0" w:before="0" w:line="240" w:lineRule="auto"/>
+            </w:pPr>
+            <w:r/>
+            <w:r>
+              <w:rPr>
+                <w:rFonts w:ascii="Times New Roman" w:hAnsi="Times New Roman" w:eastAsia="宋体"/>
+                <w:b w:val="0"/>
+                <w:sz w:val="18"/>
+              </w:rPr>
+              <w:t>100.00</w:t>
+            </w:r>
+          </w:p>
+        </w:tc>
+        <w:tc>
+          <w:tcPr>
+            <w:tcW w:type="dxa" w:w="1061"/>
+          </w:tcPr>
+          <w:p>
+            <w:pPr>
+              <w:spacing w:after="0" w:before="0" w:line="240" w:lineRule="auto"/>
+            </w:pPr>
+            <w:r/>
+            <w:r>
+              <w:rPr>
+                <w:rFonts w:ascii="Times New Roman" w:hAnsi="Times New Roman" w:eastAsia="宋体"/>
+                <w:b w:val="0"/>
+                <w:sz w:val="18"/>
+              </w:rPr>
+              <w:t>18.61</w:t>
+            </w:r>
+          </w:p>
+        </w:tc>
+        <w:tc>
+          <w:tcPr>
+            <w:tcW w:type="dxa" w:w="831"/>
+          </w:tcPr>
+          <w:p>
+            <w:pPr>
+              <w:spacing w:after="0" w:before="0" w:line="240" w:lineRule="auto"/>
+            </w:pPr>
+            <w:r/>
+            <w:r>
+              <w:rPr>
+                <w:rFonts w:ascii="Times New Roman" w:hAnsi="Times New Roman" w:eastAsia="宋体"/>
+                <w:b w:val="0"/>
+                <w:sz w:val="18"/>
+              </w:rPr>
+              <w:t>183.68</w:t>
+            </w:r>
+          </w:p>
+        </w:tc>
+        <w:tc>
+          <w:tcPr>
+            <w:tcW w:type="dxa" w:w="781"/>
+          </w:tcPr>
+          <w:p>
+            <w:pPr>
+              <w:spacing w:after="0" w:before="0" w:line="240" w:lineRule="auto"/>
+            </w:pPr>
+            <w:r/>
+            <w:r>
+              <w:rPr>
+                <w:rFonts w:ascii="Times New Roman" w:hAnsi="Times New Roman" w:eastAsia="宋体"/>
+                <w:b w:val="0"/>
+                <w:sz w:val="18"/>
+              </w:rPr>
+              <w:t>81.39</w:t>
+            </w:r>
+          </w:p>
+        </w:tc>
+      </w:tr>
+      <w:tr>
+        <w:tc>
+          <w:tcPr>
+            <w:tcW w:type="dxa" w:w="1371"/>
+          </w:tcPr>
+          <w:p>
+            <w:pPr>
+              <w:spacing w:after="0" w:before="0" w:line="240" w:lineRule="auto"/>
+            </w:pPr>
+            <w:r/>
+            <w:r>
+              <w:rPr>
+                <w:rFonts w:ascii="Times New Roman" w:hAnsi="Times New Roman" w:eastAsia="宋体"/>
+                <w:b w:val="0"/>
+                <w:sz w:val="18"/>
+              </w:rPr>
+              <w:t>v30_repeat</w:t>
+            </w:r>
+          </w:p>
+        </w:tc>
+        <w:tc>
+          <w:tcPr>
+            <w:tcW w:type="dxa" w:w="831"/>
+          </w:tcPr>
+          <w:p>
+            <w:pPr>
+              <w:spacing w:after="0" w:before="0" w:line="240" w:lineRule="auto"/>
+            </w:pPr>
+            <w:r/>
+            <w:r>
+              <w:rPr>
+                <w:rFonts w:ascii="Times New Roman" w:hAnsi="Times New Roman" w:eastAsia="宋体"/>
+                <w:b w:val="0"/>
+                <w:sz w:val="18"/>
+              </w:rPr>
+              <w:t>100.00</w:t>
+            </w:r>
+          </w:p>
+        </w:tc>
+        <w:tc>
+          <w:tcPr>
+            <w:tcW w:type="dxa" w:w="1061"/>
+          </w:tcPr>
+          <w:p>
+            <w:pPr>
+              <w:spacing w:after="0" w:before="0" w:line="240" w:lineRule="auto"/>
+            </w:pPr>
+            <w:r/>
+            <w:r>
+              <w:rPr>
+                <w:rFonts w:ascii="Times New Roman" w:hAnsi="Times New Roman" w:eastAsia="宋体"/>
+                <w:b w:val="0"/>
+                <w:sz w:val="18"/>
+              </w:rPr>
+              <w:t>3.80</w:t>
+            </w:r>
+          </w:p>
+        </w:tc>
+        <w:tc>
+          <w:tcPr>
+            <w:tcW w:type="dxa" w:w="831"/>
+          </w:tcPr>
+          <w:p>
+            <w:pPr>
+              <w:spacing w:after="0" w:before="0" w:line="240" w:lineRule="auto"/>
+            </w:pPr>
+            <w:r/>
+            <w:r>
+              <w:rPr>
+                <w:rFonts w:ascii="Times New Roman" w:hAnsi="Times New Roman" w:eastAsia="宋体"/>
+                <w:b w:val="0"/>
+                <w:sz w:val="18"/>
+              </w:rPr>
+              <w:t>76.51</w:t>
+            </w:r>
+          </w:p>
+        </w:tc>
+        <w:tc>
+          <w:tcPr>
+            <w:tcW w:type="dxa" w:w="781"/>
+          </w:tcPr>
+          <w:p>
+            <w:pPr>
+              <w:spacing w:after="0" w:before="0" w:line="240" w:lineRule="auto"/>
+            </w:pPr>
+            <w:r/>
+            <w:r>
+              <w:rPr>
+                <w:rFonts w:ascii="Times New Roman" w:hAnsi="Times New Roman" w:eastAsia="宋体"/>
+                <w:b w:val="0"/>
+                <w:sz w:val="18"/>
+              </w:rPr>
+              <w:t>96.20</w:t>
+            </w:r>
+          </w:p>
+        </w:tc>
+      </w:tr>
+      <w:tr>
+        <w:tc>
+          <w:tcPr>
+            <w:tcW w:type="dxa" w:w="1371"/>
+          </w:tcPr>
+          <w:p>
+            <w:pPr>
+              <w:spacing w:after="0" w:before="0" w:line="240" w:lineRule="auto"/>
+            </w:pPr>
+            <w:r/>
+            <w:r>
+              <w:rPr>
+                <w:rFonts w:ascii="Times New Roman" w:hAnsi="Times New Roman" w:eastAsia="宋体"/>
+                <w:b w:val="0"/>
+                <w:sz w:val="18"/>
+              </w:rPr>
+              <w:t>v62_policy</w:t>
+            </w:r>
+          </w:p>
+        </w:tc>
+        <w:tc>
+          <w:tcPr>
+            <w:tcW w:type="dxa" w:w="831"/>
+          </w:tcPr>
+          <w:p>
+            <w:pPr>
+              <w:spacing w:after="0" w:before="0" w:line="240" w:lineRule="auto"/>
+            </w:pPr>
+            <w:r/>
+            <w:r>
+              <w:rPr>
+                <w:rFonts w:ascii="Times New Roman" w:hAnsi="Times New Roman" w:eastAsia="宋体"/>
+                <w:b w:val="0"/>
+                <w:sz w:val="18"/>
+              </w:rPr>
+              <w:t>100.00</w:t>
+            </w:r>
+          </w:p>
+        </w:tc>
+        <w:tc>
+          <w:tcPr>
+            <w:tcW w:type="dxa" w:w="1061"/>
+          </w:tcPr>
+          <w:p>
+            <w:pPr>
+              <w:spacing w:after="0" w:before="0" w:line="240" w:lineRule="auto"/>
+            </w:pPr>
+            <w:r/>
+            <w:r>
+              <w:rPr>
+                <w:rFonts w:ascii="Times New Roman" w:hAnsi="Times New Roman" w:eastAsia="宋体"/>
+                <w:b w:val="0"/>
+                <w:sz w:val="18"/>
+              </w:rPr>
+              <w:t>20.61</w:t>
+            </w:r>
+          </w:p>
+        </w:tc>
+        <w:tc>
+          <w:tcPr>
+            <w:tcW w:type="dxa" w:w="831"/>
+          </w:tcPr>
+          <w:p>
+            <w:pPr>
+              <w:spacing w:after="0" w:before="0" w:line="240" w:lineRule="auto"/>
+            </w:pPr>
+            <w:r/>
+            <w:r>
+              <w:rPr>
+                <w:rFonts w:ascii="Times New Roman" w:hAnsi="Times New Roman" w:eastAsia="宋体"/>
+                <w:b w:val="0"/>
+                <w:sz w:val="18"/>
+              </w:rPr>
+              <w:t>76.49</w:t>
+            </w:r>
+          </w:p>
+        </w:tc>
+        <w:tc>
+          <w:tcPr>
+            <w:tcW w:type="dxa" w:w="781"/>
+          </w:tcPr>
+          <w:p>
+            <w:pPr>
+              <w:spacing w:after="0" w:before="0" w:line="240" w:lineRule="auto"/>
+            </w:pPr>
+            <w:r/>
+            <w:r>
+              <w:rPr>
+                <w:rFonts w:ascii="Times New Roman" w:hAnsi="Times New Roman" w:eastAsia="宋体"/>
+                <w:b w:val="0"/>
+                <w:sz w:val="18"/>
+              </w:rPr>
+              <w:t>79.39</w:t>
+            </w:r>
+          </w:p>
+        </w:tc>
+      </w:tr>
+      <w:tr>
+        <w:tc>
+          <w:tcPr>
+            <w:tcW w:type="dxa" w:w="1371"/>
+          </w:tcPr>
+          <w:p>
+            <w:pPr>
+              <w:spacing w:after="0" w:before="0" w:line="240" w:lineRule="auto"/>
+            </w:pPr>
+            <w:r/>
+            <w:r>
+              <w:rPr>
+                <w:rFonts w:ascii="Times New Roman" w:hAnsi="Times New Roman" w:eastAsia="宋体"/>
+                <w:b w:val="0"/>
+                <w:sz w:val="18"/>
+              </w:rPr>
+              <w:t>v56_counters</w:t>
+            </w:r>
+          </w:p>
+        </w:tc>
+        <w:tc>
+          <w:tcPr>
+            <w:tcW w:type="dxa" w:w="831"/>
+          </w:tcPr>
+          <w:p>
+            <w:pPr>
+              <w:spacing w:after="0" w:before="0" w:line="240" w:lineRule="auto"/>
+            </w:pPr>
+            <w:r/>
+            <w:r>
+              <w:rPr>
+                <w:rFonts w:ascii="Times New Roman" w:hAnsi="Times New Roman" w:eastAsia="宋体"/>
+                <w:b w:val="0"/>
+                <w:sz w:val="18"/>
+              </w:rPr>
+              <w:t>100.00</w:t>
+            </w:r>
+          </w:p>
+        </w:tc>
+        <w:tc>
+          <w:tcPr>
+            <w:tcW w:type="dxa" w:w="1061"/>
+          </w:tcPr>
+          <w:p>
+            <w:pPr>
+              <w:spacing w:after="0" w:before="0" w:line="240" w:lineRule="auto"/>
+            </w:pPr>
+            <w:r/>
+            <w:r>
+              <w:rPr>
+                <w:rFonts w:ascii="Times New Roman" w:hAnsi="Times New Roman" w:eastAsia="宋体"/>
+                <w:b w:val="0"/>
+                <w:sz w:val="18"/>
+              </w:rPr>
+              <w:t>0.00</w:t>
+            </w:r>
+          </w:p>
+        </w:tc>
+        <w:tc>
+          <w:tcPr>
+            <w:tcW w:type="dxa" w:w="831"/>
+          </w:tcPr>
+          <w:p>
+            <w:pPr>
+              <w:spacing w:after="0" w:before="0" w:line="240" w:lineRule="auto"/>
+            </w:pPr>
+            <w:r/>
+            <w:r>
+              <w:rPr>
+                <w:rFonts w:ascii="Times New Roman" w:hAnsi="Times New Roman" w:eastAsia="宋体"/>
+                <w:b w:val="0"/>
+                <w:sz w:val="18"/>
+              </w:rPr>
+              <w:t>25.83</w:t>
+            </w:r>
+          </w:p>
+        </w:tc>
+        <w:tc>
+          <w:tcPr>
+            <w:tcW w:type="dxa" w:w="781"/>
+          </w:tcPr>
+          <w:p>
+            <w:pPr>
+              <w:spacing w:after="0" w:before="0" w:line="240" w:lineRule="auto"/>
+            </w:pPr>
+            <w:r/>
+            <w:r>
+              <w:rPr>
+                <w:rFonts w:ascii="Times New Roman" w:hAnsi="Times New Roman" w:eastAsia="宋体"/>
+                <w:b w:val="0"/>
+                <w:sz w:val="18"/>
+              </w:rPr>
+              <w:t>100.00</w:t>
+            </w:r>
+          </w:p>
+        </w:tc>
+      </w:tr>
+    </w:tbl>
+    <w:p>
+      <w:pPr>
+        <w:spacing w:after="40" w:line="276" w:lineRule="auto"/>
+        <w:ind w:firstLine="360"/>
+      </w:pPr>
+      <w:r>
+        <w:rPr>
+          <w:rFonts w:ascii="Times New Roman" w:hAnsi="Times New Roman" w:eastAsia="宋体"/>
+          <w:b/>
+          <w:sz w:val="18"/>
+        </w:rPr>
+        <w:t>每一轮的自报命中率都接近或等于满格，而每一轮都付出了 25.83—280.65 GB 的 `hit I/O`。</w:t>
+      </w:r>
+      <w:r>
+        <w:rPr>
+          <w:rFonts w:ascii="Times New Roman" w:hAnsi="Times New Roman" w:eastAsia="宋体"/>
+          <w:b w:val="0"/>
+          <w:sz w:val="18"/>
+        </w:rPr>
+        <w:t xml:space="preserve"> 另外 2 轮自报 99.05% 与 99.73% 时，</w:t>
+      </w:r>
+      <w:r>
+        <w:rPr>
+          <w:rFonts w:ascii="Consolas" w:hAnsi="Consolas"/>
+          <w:color w:val="000080"/>
+          <w:sz w:val="18"/>
+        </w:rPr>
+        <w:t>hit I/O</w:t>
+      </w:r>
+      <w:r>
+        <w:rPr>
+          <w:rFonts w:ascii="Times New Roman" w:hAnsi="Times New Roman" w:eastAsia="宋体"/>
+          <w:b w:val="0"/>
+          <w:sz w:val="18"/>
+        </w:rPr>
+        <w:t xml:space="preserve"> 分别为 280.65 GB 与 181.19 GB——</w:t>
+      </w:r>
+      <w:r>
+        <w:rPr>
+          <w:rFonts w:ascii="Times New Roman" w:hAnsi="Times New Roman" w:eastAsia="宋体"/>
+          <w:b/>
+          <w:sz w:val="18"/>
+        </w:rPr>
+        <w:t>问题不限于满格，任何命中率下字节都在付</w:t>
+      </w:r>
+      <w:r>
+        <w:rPr>
+          <w:rFonts w:ascii="Times New Roman" w:hAnsi="Times New Roman" w:eastAsia="宋体"/>
+          <w:b w:val="0"/>
+          <w:sz w:val="18"/>
+        </w:rPr>
+        <w:t>。表 3 出自主机 A 的内存阶梯扫描，表 4 出自主机 B 的引擎日志，二者机器不同、实验形态不同、时间不同，互不依赖却指向同一结论：这正是本文所主张的，该计数器度量的是"键是否在场"，与"字节是否免除"之间没有稳定关系。</w:t>
+      </w:r>
+    </w:p>
+    <w:p>
+      <w:pPr>
         <w:spacing w:after="40" w:before="80" w:line="240" w:lineRule="auto"/>
       </w:pPr>
       <w:r>
@@ -4439,7 +5330,7 @@
           <w:b w:val="0"/>
           <w:sz w:val="15"/>
         </w:rPr>
-        <w:t>表 4　驻留配额扫描台账</w:t>
+        <w:t>表 5　驻留配额扫描台账</w:t>
       </w:r>
     </w:p>
     <w:p>
@@ -4453,7 +5344,7 @@
           <w:b w:val="0"/>
           <w:sz w:val="15"/>
         </w:rPr>
-        <w:t>Table 4　Residence-quota scan ledger</w:t>
+        <w:t>Table 5　Residence-quota scan ledger</w:t>
       </w:r>
     </w:p>
     <w:tbl>
@@ -6738,7 +7629,7 @@
           <w:b w:val="0"/>
           <w:sz w:val="18"/>
         </w:rPr>
-        <w:t xml:space="preserve">（4595 请求 / 216.66 GB）归并的 30 次运行构成一组（D4 一行见表 5，台账见图 4）。这 30 次取自该主机的多轮实验，涵盖多个引擎版本与策略设置（逐次运行号见本仓库台账的 </w:t>
+        <w:t xml:space="preserve">（4595 请求 / 216.66 GB）归并的 30 次运行构成一组（D4 一行见表 6，台账见图 4）。这 30 次取自该主机的多轮实验，涵盖多个引擎版本与策略设置（逐次运行号见本仓库台账的 </w:t>
       </w:r>
       <w:r>
         <w:rPr>
@@ -7260,7 +8151,7 @@
           <w:b w:val="0"/>
           <w:sz w:val="15"/>
         </w:rPr>
-        <w:t>表 5　平面分离实例与台账自检</w:t>
+        <w:t>表 6　平面分离实例与台账自检</w:t>
       </w:r>
     </w:p>
     <w:p>
@@ -7274,7 +8165,7 @@
           <w:b w:val="0"/>
           <w:sz w:val="15"/>
         </w:rPr>
-        <w:t>Table 5　Plane-separation instances and ledger self-check</w:t>
+        <w:t>Table 6　Plane-separation instances and ledger self-check</w:t>
       </w:r>
     </w:p>
     <w:tbl>
@@ -7604,7 +8495,7 @@
                 <w:b w:val="0"/>
                 <w:sz w:val="18"/>
               </w:rPr>
-              <w:t>表 3 + 表 4，24 点（主机 A）</w:t>
+              <w:t>表 3 + 表 5，24 点（主机 A）</w:t>
             </w:r>
           </w:p>
         </w:tc>
@@ -7914,7 +8805,7 @@
           <w:b w:val="0"/>
           <w:sz w:val="18"/>
         </w:rPr>
-        <w:t>以本案时间平面 CV = 13.43%（主机 B，30 次同字节口径运行，其中含配置效应，见该节限定）代入，得两个平面的分辨率对照（表 6）：</w:t>
+        <w:t>以本案时间平面 CV = 13.43%（主机 B，30 次同字节口径运行，其中含配置效应，见该节限定）代入，得两个平面的分辨率对照（表 7）：</w:t>
       </w:r>
     </w:p>
     <w:p>
@@ -7928,7 +8819,7 @@
           <w:b w:val="0"/>
           <w:sz w:val="15"/>
         </w:rPr>
-        <w:t>表 6　两个平面的分辨率对照</w:t>
+        <w:t>表 7　两个平面的分辨率对照</w:t>
       </w:r>
     </w:p>
     <w:p>
@@ -7942,7 +8833,7 @@
           <w:b w:val="0"/>
           <w:sz w:val="15"/>
         </w:rPr>
-        <w:t>Table 6　Resolution contrast between the two planes</w:t>
+        <w:t>Table 7　Resolution contrast between the two planes</w:t>
       </w:r>
     </w:p>
     <w:tbl>
@@ -8485,7 +9376,7 @@
           <w:b w:val="0"/>
           <w:sz w:val="15"/>
         </w:rPr>
-        <w:t>表 7　实测时间与带宽下界之比</w:t>
+        <w:t>表 8　实测时间与带宽下界之比</w:t>
       </w:r>
     </w:p>
     <w:p>
@@ -8499,7 +9390,7 @@
           <w:b w:val="0"/>
           <w:sz w:val="15"/>
         </w:rPr>
-        <w:t>Table 7　Ratio of measured time to the bandwidth lower bound</w:t>
+        <w:t>Table 8　Ratio of measured time to the bandwidth lower bound</w:t>
       </w:r>
     </w:p>
     <w:tbl>
@@ -9155,7 +10046,7 @@
           <w:b w:val="0"/>
           <w:sz w:val="18"/>
         </w:rPr>
-        <w:t>。按相位拆分（表 8，对应表 7 的 D 档）可见暴露集中在专家流。四个配置的实测时间与带宽下界之比并列见图 6。</w:t>
+        <w:t>。按相位拆分（表 9，对应表 7 的 D 档）可见暴露集中在专家流。四个配置的实测时间与带宽下界之比并列见图 6。</w:t>
       </w:r>
     </w:p>
     <w:p>
@@ -9237,7 +10128,7 @@
           <w:b w:val="0"/>
           <w:sz w:val="15"/>
         </w:rPr>
-        <w:t>表 8　各流的相位字节与串行暴露</w:t>
+        <w:t>表 9　各流的相位字节与串行暴露</w:t>
       </w:r>
     </w:p>
     <w:p>
@@ -9251,7 +10142,7 @@
           <w:b w:val="0"/>
           <w:sz w:val="15"/>
         </w:rPr>
-        <w:t>Table 8　Per-phase bytes and serialization exposure by stream</w:t>
+        <w:t>Table 9　Per-phase bytes and serialization exposure by stream</w:t>
       </w:r>
     </w:p>
     <w:tbl>
@@ -9881,7 +10772,7 @@
           <w:b w:val="0"/>
           <w:sz w:val="18"/>
         </w:rPr>
-        <w:t>综合第 3、4、5 章，给出四级验收阶梯（表 9）。逐级通过方可进入下一级；任一级失败即停，不得以更高一级的好看数字覆盖。</w:t>
+        <w:t>综合第 3、4、5 章，给出四级验收阶梯（表 10）。逐级通过方可进入下一级；任一级失败即停，不得以更高一级的好看数字覆盖。</w:t>
       </w:r>
     </w:p>
     <w:p>
@@ -9895,7 +10786,7 @@
           <w:b w:val="0"/>
           <w:sz w:val="15"/>
         </w:rPr>
-        <w:t>表 9　三平面分级验收标准</w:t>
+        <w:t>表 10　三平面分级验收标准</w:t>
       </w:r>
     </w:p>
     <w:p>
@@ -9909,7 +10800,7 @@
           <w:b w:val="0"/>
           <w:sz w:val="15"/>
         </w:rPr>
-        <w:t>Table 9　Tiered acceptance criteria for the three planes</w:t>
+        <w:t>Table 10　Tiered acceptance criteria for the three planes</w:t>
       </w:r>
     </w:p>
     <w:tbl>
@@ -10560,7 +11451,7 @@
           <w:b w:val="0"/>
           <w:sz w:val="18"/>
         </w:rPr>
-        <w:t>3. E → 1 而 L4 比值 ≫ 1 → 字节已达下界，转串行暴露诊断（表 7、表 8）；</w:t>
+        <w:t>3. E → 1 而 L4 比值 ≫ 1 → 字节已达下界，转串行暴露诊断（表 8、表 9）；</w:t>
       </w:r>
     </w:p>
     <w:p>
@@ -10622,7 +11513,7 @@
           <w:b w:val="0"/>
           <w:sz w:val="18"/>
         </w:rPr>
-        <w:t xml:space="preserve"> 全部数字来自两个引擎版本序列与两台主机：主机 A（EPYC 7763，228 GiB，3.2 GB/s NVMe 源层，N = 8 冷启动）承载表 3、表 4 与恒等式核验；主机 B（Hygon 8 核 / 56 GB，机械慢盘 + NVMe，WSL2，1 提示 + 3 生成词元）承载重复运行、策略四臂与表 7、表 8。两台的源层物理层、内存量级与并发上限都不同，因此</w:t>
+        <w:t xml:space="preserve"> 全部数字来自两个引擎版本序列与两台主机：主机 A（EPYC 7763，228 GiB，3.2 GB/s NVMe 源层，N = 8 冷启动）承载表 3、表 4 与恒等式核验；主机 B（Hygon 8 核 / 56 GB，机械慢盘 + NVMe，WSL2，1 提示 + 3 生成词元）承载重复运行、策略四臂与表 8、表 9。两台的源层物理层、内存量级与并发上限都不同，因此</w:t>
       </w:r>
       <w:r>
         <w:rPr>

</xml_diff>